<commit_message>
Corrige salto de pagina en paquete de retiro voluntario
</commit_message>
<xml_diff>
--- a/app/templates/rrll/paquete/paquete_retiro_voluntario.docx
+++ b/app/templates/rrll/paquete/paquete_retiro_voluntario.docx
@@ -917,25 +917,7 @@
           <w:sz w:val="20"/>
           <w:szCs w:val="20"/>
         </w:rPr>
-        <w:t xml:space="preserve">Con la presente le invitamos a practicarse el Examen Médico Ocupacional de Egreso; para tal fin debe contactar a nuestro proveedor de exámenes médicos </w:t>
-      </w:r>
-      <w:proofErr w:type="spellStart"/>
-      <w:r>
-        <w:rPr>
-          <w:rFonts w:ascii="Arial Narrow" w:hAnsi="Arial Narrow"/>
-          <w:sz w:val="20"/>
-          <w:szCs w:val="20"/>
-        </w:rPr>
-        <w:t>Colmedicos</w:t>
-      </w:r>
-      <w:proofErr w:type="spellEnd"/>
-      <w:r>
-        <w:rPr>
-          <w:rFonts w:ascii="Arial Narrow" w:hAnsi="Arial Narrow"/>
-          <w:sz w:val="20"/>
-          <w:szCs w:val="20"/>
-        </w:rPr>
-        <w:t xml:space="preserve">, para agendar la cita, dentro de un periodo no mayor </w:t>
+        <w:t xml:space="preserve">Con la presente le invitamos a practicarse el Examen Médico Ocupacional de Egreso; para tal fin debe contactar a nuestro proveedor de exámenes médicos Colmedicos, para agendar la cita, dentro de un periodo no mayor </w:t>
       </w:r>
       <w:r>
         <w:rPr>
@@ -1167,7 +1149,11 @@
           <w:szCs w:val="20"/>
         </w:rPr>
       </w:pPr>
-      <w:r>
+    </w:p>
+    <w:p>
+      <w:pPr>
+        <w:spacing w:before="240"/>
+        <w:jc w:val="center"/>
         <w:rPr>
           <w:rFonts w:ascii="Arial Narrow" w:hAnsi="Arial Narrow"/>
           <w:b/>
@@ -1175,8 +1161,7 @@
           <w:sz w:val="20"/>
           <w:szCs w:val="20"/>
         </w:rPr>
-        <w:t>INFORMACIÓN IMPORTANTE</w:t>
-      </w:r>
+      </w:pPr>
     </w:p>
     <w:p>
       <w:pPr>
@@ -1190,6 +1175,16 @@
           <w:szCs w:val="20"/>
         </w:rPr>
       </w:pPr>
+      <w:r>
+        <w:rPr>
+          <w:rFonts w:ascii="Arial Narrow" w:hAnsi="Arial Narrow"/>
+          <w:b/>
+          <w:bCs/>
+          <w:sz w:val="20"/>
+          <w:szCs w:val="20"/>
+        </w:rPr>
+        <w:t>INFORMACIÓN IMPORTANTE</w:t>
+      </w:r>
     </w:p>
     <w:p>
       <w:pPr>
@@ -1671,23 +1666,7 @@
           <w:sz w:val="16"/>
           <w:szCs w:val="16"/>
         </w:rPr>
-        <w:t xml:space="preserve">4. Estar inscrito en programas de capacitación y </w:t>
-      </w:r>
-      <w:proofErr w:type="spellStart"/>
-      <w:r>
-        <w:rPr>
-          <w:sz w:val="16"/>
-          <w:szCs w:val="16"/>
-        </w:rPr>
-        <w:t>re-entrenamiento</w:t>
-      </w:r>
-      <w:proofErr w:type="spellEnd"/>
-      <w:r>
-        <w:rPr>
-          <w:sz w:val="16"/>
-          <w:szCs w:val="16"/>
-        </w:rPr>
-        <w:t xml:space="preserve"> en los términos dispuestos por la reglamentación que expida el Gobierno Nacional.</w:t>
+        <w:t>4. Estar inscrito en programas de capacitación y re-entrenamiento en los términos dispuestos por la reglamentación que expida el Gobierno Nacional.</w:t>
       </w:r>
     </w:p>
     <w:p>
@@ -1860,7 +1839,6 @@
           <w:sz w:val="16"/>
           <w:szCs w:val="16"/>
         </w:rPr>
-        <w:lastRenderedPageBreak/>
         <w:t>de Fomento al Empleo y Protección al Cesante, esta decisión contará con el recurso de reposición ante la Caja de Compensación donde presentó la solicitud.</w:t>
       </w:r>
     </w:p>
@@ -2027,115 +2005,51 @@
           <w:sz w:val="16"/>
           <w:szCs w:val="16"/>
         </w:rPr>
-        <w:t>¿</w:t>
-      </w:r>
-      <w:proofErr w:type="spellStart"/>
-      <w:r>
-        <w:rPr>
-          <w:sz w:val="16"/>
-          <w:szCs w:val="16"/>
-        </w:rPr>
-        <w:t>Que</w:t>
-      </w:r>
-      <w:proofErr w:type="spellEnd"/>
-      <w:r>
-        <w:rPr>
-          <w:sz w:val="16"/>
-          <w:szCs w:val="16"/>
-        </w:rPr>
-        <w:t xml:space="preserve"> es, y como se pagan los beneficios?</w:t>
-      </w:r>
-    </w:p>
-    <w:p>
-      <w:pPr>
-        <w:spacing w:line="240" w:lineRule="auto"/>
-        <w:jc w:val="both"/>
-        <w:rPr>
-          <w:sz w:val="16"/>
-          <w:szCs w:val="16"/>
-        </w:rPr>
-      </w:pPr>
-      <w:r>
-        <w:rPr>
-          <w:sz w:val="16"/>
-          <w:szCs w:val="16"/>
-        </w:rPr>
-        <w:t xml:space="preserve">Los trabajadores que cumplan con el requisito de aportes a Cajas de Compensación Familiar recibirán un beneficio, con cargo al </w:t>
-      </w:r>
-      <w:proofErr w:type="spellStart"/>
-      <w:r>
-        <w:rPr>
-          <w:sz w:val="16"/>
-          <w:szCs w:val="16"/>
-        </w:rPr>
-        <w:t>Fosfec</w:t>
-      </w:r>
-      <w:proofErr w:type="spellEnd"/>
-      <w:r>
-        <w:rPr>
-          <w:sz w:val="16"/>
-          <w:szCs w:val="16"/>
-        </w:rPr>
-        <w:t xml:space="preserve">, que consistirá en aportes al Sistema de Salud y Pensiones, calculado sobre un (1) </w:t>
-      </w:r>
-      <w:proofErr w:type="spellStart"/>
-      <w:r>
-        <w:rPr>
-          <w:sz w:val="16"/>
-          <w:szCs w:val="16"/>
-        </w:rPr>
-        <w:t>smmlv</w:t>
-      </w:r>
-      <w:proofErr w:type="spellEnd"/>
-      <w:r>
-        <w:rPr>
-          <w:sz w:val="16"/>
-          <w:szCs w:val="16"/>
-        </w:rPr>
-        <w:t>. También tendrá acceso a la cuota monetaria del subsidio familiar en las condiciones establecidas en la legislación vigente de acuerdo con lo que reglamente el Gobierno Nacional.</w:t>
-      </w:r>
-    </w:p>
-    <w:p>
-      <w:pPr>
-        <w:spacing w:line="240" w:lineRule="auto"/>
-        <w:jc w:val="both"/>
-        <w:rPr>
-          <w:sz w:val="16"/>
-          <w:szCs w:val="16"/>
-        </w:rPr>
-      </w:pPr>
-    </w:p>
-    <w:p>
-      <w:pPr>
-        <w:spacing w:line="240" w:lineRule="auto"/>
-        <w:jc w:val="both"/>
-        <w:rPr>
-          <w:sz w:val="16"/>
-          <w:szCs w:val="16"/>
-        </w:rPr>
-      </w:pPr>
-      <w:r>
-        <w:rPr>
-          <w:sz w:val="16"/>
-          <w:szCs w:val="16"/>
-        </w:rPr>
-        <w:t>¿</w:t>
-      </w:r>
-      <w:proofErr w:type="spellStart"/>
-      <w:r>
-        <w:rPr>
-          <w:sz w:val="16"/>
-          <w:szCs w:val="16"/>
-        </w:rPr>
-        <w:t>Que</w:t>
-      </w:r>
-      <w:proofErr w:type="spellEnd"/>
-      <w:r>
-        <w:rPr>
-          <w:sz w:val="16"/>
-          <w:szCs w:val="16"/>
-        </w:rPr>
-        <w:t xml:space="preserve"> es la Capacitación para inserción laboral?</w:t>
+        <w:t>¿Que es, y como se pagan los beneficios?</w:t>
+      </w:r>
+    </w:p>
+    <w:p>
+      <w:pPr>
+        <w:spacing w:line="240" w:lineRule="auto"/>
+        <w:jc w:val="both"/>
+        <w:rPr>
+          <w:sz w:val="16"/>
+          <w:szCs w:val="16"/>
+        </w:rPr>
+      </w:pPr>
+      <w:r>
+        <w:rPr>
+          <w:sz w:val="16"/>
+          <w:szCs w:val="16"/>
+        </w:rPr>
+        <w:t>Los trabajadores que cumplan con el requisito de aportes a Cajas de Compensación Familiar recibirán un beneficio, con cargo al Fosfec, que consistirá en aportes al Sistema de Salud y Pensiones, calculado sobre un (1) smmlv. También tendrá acceso a la cuota monetaria del subsidio familiar en las condiciones establecidas en la legislación vigente de acuerdo con lo que reglamente el Gobierno Nacional.</w:t>
+      </w:r>
+    </w:p>
+    <w:p>
+      <w:pPr>
+        <w:spacing w:line="240" w:lineRule="auto"/>
+        <w:jc w:val="both"/>
+        <w:rPr>
+          <w:sz w:val="16"/>
+          <w:szCs w:val="16"/>
+        </w:rPr>
+      </w:pPr>
+    </w:p>
+    <w:p>
+      <w:pPr>
+        <w:spacing w:line="240" w:lineRule="auto"/>
+        <w:jc w:val="both"/>
+        <w:rPr>
+          <w:sz w:val="16"/>
+          <w:szCs w:val="16"/>
+        </w:rPr>
+      </w:pPr>
+      <w:r>
+        <w:rPr>
+          <w:sz w:val="16"/>
+          <w:szCs w:val="16"/>
+        </w:rPr>
+        <w:t>¿Que es la Capacitación para inserción laboral?</w:t>
       </w:r>
     </w:p>
     <w:p>
@@ -2179,23 +2093,7 @@
           <w:sz w:val="16"/>
           <w:szCs w:val="16"/>
         </w:rPr>
-        <w:t xml:space="preserve">En conclusión, </w:t>
-      </w:r>
-      <w:proofErr w:type="spellStart"/>
-      <w:r>
-        <w:rPr>
-          <w:sz w:val="16"/>
-          <w:szCs w:val="16"/>
-        </w:rPr>
-        <w:t>cuales</w:t>
-      </w:r>
-      <w:proofErr w:type="spellEnd"/>
-      <w:r>
-        <w:rPr>
-          <w:sz w:val="16"/>
-          <w:szCs w:val="16"/>
-        </w:rPr>
-        <w:t xml:space="preserve"> son los beneficios?</w:t>
+        <w:t>En conclusión, cuales son los beneficios?</w:t>
       </w:r>
     </w:p>
     <w:p>

</xml_diff>